<commit_message>
Rebuild CV docx cleanly from cv.md (fixes broken bold/line wraps from first conversion)
Co-Authored-By: Claude Opus 5.5 <noreply@anthropic.com>
</commit_message>
<xml_diff>
--- a/applications/Khalid-Dallol-CV.docx
+++ b/applications/Khalid-Dallol-CV.docx
@@ -21,12 +21,10 @@
     </w:p>
     <w:p>
       <w:r>
-        <w:t>Birmingham, UK | 07833 357277 | kwa7sh55@gmail.com |</w:t>
-      </w:r>
-    </w:p>
-    <w:p>
-      <w:r>
-        <w:t>linkedin.com/in/khalid-dallol-450952227 | github.com/Khalid81i</w:t>
+        <w:rPr>
+          <w:b w:val="0"/>
+        </w:rPr>
+        <w:t>Birmingham, UK | 07833 357277 | kwa7sh55@gmail.com | linkedin.com/in/khalid-dallol-450952227 | github.com/Khalid81i</w:t>
       </w:r>
     </w:p>
     <w:p>
@@ -39,37 +37,10 @@
     </w:p>
     <w:p>
       <w:r>
-        <w:t>Electrical and Electronic Engineering graduate with a 2:1 and hands-on</w:t>
-      </w:r>
-    </w:p>
-    <w:p>
-      <w:r>
-        <w:t>experience spanning control systems, electronics, MATLAB modelling,</w:t>
-      </w:r>
-    </w:p>
-    <w:p>
-      <w:r>
-        <w:t>embedded systems, programming and technical data analysis. Comfortable</w:t>
-      </w:r>
-    </w:p>
-    <w:p>
-      <w:r>
-        <w:t>breaking complex problems into testable steps, documenting results and</w:t>
-      </w:r>
-    </w:p>
-    <w:p>
-      <w:r>
-        <w:t>learning unfamiliar systems quickly. Seeking a graduate engineering role</w:t>
-      </w:r>
-    </w:p>
-    <w:p>
-      <w:r>
-        <w:t>with structured development and progression toward greater technical</w:t>
-      </w:r>
-    </w:p>
-    <w:p>
-      <w:r>
-        <w:t>responsibility.</w:t>
+        <w:rPr>
+          <w:b w:val="0"/>
+        </w:rPr>
+        <w:t>Electrical and Electronic Engineering graduate with a 2:1 and hands-on experience spanning control systems, electronics, MATLAB modelling, embedded systems, programming and technical data analysis. Comfortable breaking complex problems into testable steps, documenting results and learning unfamiliar systems quickly. Seeking a graduate engineering role with structured development and progression toward greater technical responsibility.</w:t>
       </w:r>
     </w:p>
     <w:p>
@@ -82,17 +53,10 @@
     </w:p>
     <w:p>
       <w:r>
-        <w:t>Electrical engineering • Control systems • MATLAB • Python • C/C++</w:t>
-      </w:r>
-    </w:p>
-    <w:p>
-      <w:r>
-        <w:t>fundamentals • C# • Embedded/IoT systems • Electronics testing •</w:t>
-      </w:r>
-    </w:p>
-    <w:p>
-      <w:r>
-        <w:t>Numerical modelling • Git/GitHub • Linux • Technical documentation</w:t>
+        <w:rPr>
+          <w:b w:val="0"/>
+        </w:rPr>
+        <w:t>Electrical engineering • Control systems • MATLAB • Python • C/C++ fundamentals • C# • Embedded/IoT systems • Electronics testing • Numerical modelling • Git/GitHub • Linux • Technical documentation</w:t>
       </w:r>
     </w:p>
     <w:p>
@@ -108,16 +72,15 @@
         <w:rPr>
           <w:b/>
         </w:rPr>
-        <w:t>BEng (Hons) Electrical and Electronic Engineering - Upp</w:t>
+        <w:t>BEng (Hons) Electrical and Electronic Engineering - Upper Second-Class Honours (2:1), awarded 2026</w:t>
       </w:r>
-    </w:p>
-    <w:p>
       <w:r>
-        <w:t>Second-Class Honours (2:1), awarded 2026**</w:t>
+        <w:br/>
       </w:r>
-    </w:p>
-    <w:p>
       <w:r>
+        <w:rPr>
+          <w:b w:val="0"/>
+        </w:rPr>
         <w:t>University of Greenwich | 2022-2026</w:t>
       </w:r>
     </w:p>
@@ -126,22 +89,10 @@
         <w:pStyle w:val="ListBullet"/>
       </w:pPr>
       <w:r>
-        <w:t>Key modules: Power Systems; Control and Instrumentation;</w:t>
-      </w:r>
-    </w:p>
-    <w:p>
-      <w:r>
-        <w:t>Electrical Circuits; Analogue Electronics; Digital and Embedded</w:t>
-      </w:r>
-    </w:p>
-    <w:p>
-      <w:r>
-        <w:t>Systems; Communications; Programming; Engineering Mathematics.</w:t>
-      </w:r>
-    </w:p>
-    <w:p>
-      <w:r>
-        <w:t>&gt;</w:t>
+        <w:rPr>
+          <w:b w:val="0"/>
+        </w:rPr>
+        <w:t>Key modules: Power Systems; Control and Instrumentation; Electrical Circuits; Analogue Electronics; Digital and Embedded Systems; Communications; Programming; Engineering Mathematics.</w:t>
       </w:r>
     </w:p>
     <w:p>
@@ -149,12 +100,10 @@
         <w:pStyle w:val="ListBullet"/>
       </w:pPr>
       <w:r>
-        <w:t>Final-year project: Double-Sided LCL-Compensated Capacitive Power</w:t>
-      </w:r>
-    </w:p>
-    <w:p>
-      <w:r>
-        <w:t>Transfer (MATLAB modelling and simulation).</w:t>
+        <w:rPr>
+          <w:b w:val="0"/>
+        </w:rPr>
+        <w:t>Final-year project: Double-Sided LCL-Compensated Capacitive Power Transfer (MATLAB modelling and simulation).</w:t>
       </w:r>
     </w:p>
     <w:p>
@@ -162,16 +111,15 @@
         <w:rPr>
           <w:b/>
         </w:rPr>
-        <w:t>Level 3 Extended Diploma in Aeronautical Engineering (A-lev</w:t>
+        <w:t>Level 3 Extended Diploma in Aeronautical Engineering (A-level equivalent) - DMM (Distinction, Merit, Merit; 112 UCAS points)</w:t>
       </w:r>
-    </w:p>
-    <w:p>
       <w:r>
-        <w:t>equivalent) - DMM (Distinction, Merit, Merit; 112 UCAS points)**</w:t>
+        <w:br/>
       </w:r>
-    </w:p>
-    <w:p>
       <w:r>
+        <w:rPr>
+          <w:b w:val="0"/>
+        </w:rPr>
         <w:t>Solihull College | 2020-2022</w:t>
       </w:r>
     </w:p>
@@ -183,6 +131,9 @@
         <w:t>GCSEs:</w:t>
       </w:r>
       <w:r>
+        <w:rPr>
+          <w:b w:val="0"/>
+        </w:rPr>
         <w:t xml:space="preserve"> English Language (7), English Literature (5), Mathematics (4)</w:t>
       </w:r>
     </w:p>
@@ -202,17 +153,10 @@
         <w:t>Double-Sided LCL-Compensated Capacitive Power Transfer:</w:t>
       </w:r>
       <w:r>
-        <w:t xml:space="preserve"> Modelled and</w:t>
-      </w:r>
-    </w:p>
-    <w:p>
-      <w:r>
-        <w:t>simulated a compensated capacitive power-transfer system in MATLAB using</w:t>
-      </w:r>
-    </w:p>
-    <w:p>
-      <w:r>
-        <w:t>ODE/RK4 methods, analysing system behaviour and engineering trade-offs.</w:t>
+        <w:rPr>
+          <w:b w:val="0"/>
+        </w:rPr>
+        <w:t xml:space="preserve"> Modelled and simulated a compensated capacitive power-transfer system in MATLAB using ODE/RK4 methods, analysing system behaviour and engineering trade-offs.</w:t>
       </w:r>
     </w:p>
     <w:p>
@@ -223,17 +167,10 @@
         <w:t>DC Motor Control:</w:t>
       </w:r>
       <w:r>
-        <w:t xml:space="preserve"> Modelled motor response and controller behaviour,</w:t>
-      </w:r>
-    </w:p>
-    <w:p>
-      <w:r>
-        <w:t>including proportional-control tuning and analysis of transient</w:t>
-      </w:r>
-    </w:p>
-    <w:p>
-      <w:r>
-        <w:t>response.</w:t>
+        <w:rPr>
+          <w:b w:val="0"/>
+        </w:rPr>
+        <w:t xml:space="preserve"> Modelled motor response and controller behaviour, including proportional-control tuning and analysis of transient response.</w:t>
       </w:r>
     </w:p>
     <w:p>
@@ -244,12 +181,10 @@
         <w:t>HomeAir ESP32 System:</w:t>
       </w:r>
       <w:r>
-        <w:t xml:space="preserve"> Developed an embedded/IoT prototype around</w:t>
-      </w:r>
-    </w:p>
-    <w:p>
-      <w:r>
-        <w:t>ESP32 hardware, combining sensing, system logic and practical debugging.</w:t>
+        <w:rPr>
+          <w:b w:val="0"/>
+        </w:rPr>
+        <w:t xml:space="preserve"> Developed an embedded/IoT prototype around ESP32 hardware, combining sensing, system logic and practical debugging.</w:t>
       </w:r>
     </w:p>
     <w:p>
@@ -268,12 +203,10 @@
         <w:t>Medical Receptionist</w:t>
       </w:r>
       <w:r>
-        <w:t xml:space="preserve"> | Strensham Road Surgery, NHS | Jun</w:t>
-      </w:r>
-    </w:p>
-    <w:p>
-      <w:r>
-        <w:t>2021-Present</w:t>
+        <w:rPr>
+          <w:b w:val="0"/>
+        </w:rPr>
+        <w:t xml:space="preserve"> | Strensham Road Surgery, NHS | Jun 2021-Present</w:t>
       </w:r>
     </w:p>
     <w:p>
@@ -281,22 +214,10 @@
         <w:pStyle w:val="ListBullet"/>
       </w:pPr>
       <w:r>
-        <w:t>Coordinate day-to-day administrative workflows in a regulated</w:t>
-      </w:r>
-    </w:p>
-    <w:p>
-      <w:r>
-        <w:t>healthcare environment, handling patient enquiries, records and</w:t>
-      </w:r>
-    </w:p>
-    <w:p>
-      <w:r>
-        <w:t>time-sensitive requests.</w:t>
-      </w:r>
-    </w:p>
-    <w:p>
-      <w:r>
-        <w:t>&gt;</w:t>
+        <w:rPr>
+          <w:b w:val="0"/>
+        </w:rPr>
+        <w:t>Coordinate day-to-day administrative workflows in a regulated healthcare environment, handling patient enquiries, records and time-sensitive requests.</w:t>
       </w:r>
     </w:p>
     <w:p>
@@ -304,22 +225,10 @@
         <w:pStyle w:val="ListBullet"/>
       </w:pPr>
       <w:r>
-        <w:t>Support recruitment, onboarding, staff records and compliance</w:t>
-      </w:r>
-    </w:p>
-    <w:p>
-      <w:r>
-        <w:t>processes, requiring accuracy, confidentiality and clear</w:t>
-      </w:r>
-    </w:p>
-    <w:p>
-      <w:r>
-        <w:t>communication.</w:t>
-      </w:r>
-    </w:p>
-    <w:p>
-      <w:r>
-        <w:t>&gt;</w:t>
+        <w:rPr>
+          <w:b w:val="0"/>
+        </w:rPr>
+        <w:t>Support recruitment, onboarding, staff records and compliance processes, requiring accuracy, confidentiality and clear communication.</w:t>
       </w:r>
     </w:p>
     <w:p>
@@ -327,12 +236,10 @@
         <w:pStyle w:val="ListBullet"/>
       </w:pPr>
       <w:r>
-        <w:t>Use Microsoft Office and structured tracking to improve visibility</w:t>
-      </w:r>
-    </w:p>
-    <w:p>
-      <w:r>
-        <w:t>of operational and compliance tasks.</w:t>
+        <w:rPr>
+          <w:b w:val="0"/>
+        </w:rPr>
+        <w:t>Use Microsoft Office and structured tracking to improve visibility of operational and compliance tasks.</w:t>
       </w:r>
     </w:p>
     <w:p>
@@ -343,12 +250,10 @@
         <w:t>Bioinformatics Intern (remote)</w:t>
       </w:r>
       <w:r>
-        <w:t xml:space="preserve"> | Noor Diagnostics and Discovery</w:t>
-      </w:r>
-    </w:p>
-    <w:p>
-      <w:r>
-        <w:t>(NoorDX) | Jul 2025-May 2026</w:t>
+        <w:rPr>
+          <w:b w:val="0"/>
+        </w:rPr>
+        <w:t xml:space="preserve"> | Noor Diagnostics and Discovery (NoorDX) | Jul 2025-May 2026</w:t>
       </w:r>
     </w:p>
     <w:p>
@@ -356,22 +261,10 @@
         <w:pStyle w:val="ListBullet"/>
       </w:pPr>
       <w:r>
-        <w:t>Cleaned, normalised, validated and filtered large genomic datasets</w:t>
-      </w:r>
-    </w:p>
-    <w:p>
-      <w:r>
-        <w:t>using Bash and command-line tools, with a strong focus on data</w:t>
-      </w:r>
-    </w:p>
-    <w:p>
-      <w:r>
-        <w:t>quality.</w:t>
-      </w:r>
-    </w:p>
-    <w:p>
-      <w:r>
-        <w:t>&gt;</w:t>
+        <w:rPr>
+          <w:b w:val="0"/>
+        </w:rPr>
+        <w:t>Cleaned, normalised, validated and filtered large genomic datasets using Bash and command-line tools, with a strong focus on data quality.</w:t>
       </w:r>
     </w:p>
     <w:p>
@@ -379,17 +272,10 @@
         <w:pStyle w:val="ListBullet"/>
       </w:pPr>
       <w:r>
-        <w:t>Built reproducible analytical workflows and documented technical</w:t>
-      </w:r>
-    </w:p>
-    <w:p>
-      <w:r>
-        <w:t>processes for reliable handover and repeat use.</w:t>
-      </w:r>
-    </w:p>
-    <w:p>
-      <w:r>
-        <w:t>&gt;</w:t>
+        <w:rPr>
+          <w:b w:val="0"/>
+        </w:rPr>
+        <w:t>Built reproducible analytical workflows and documented technical processes for reliable handover and repeat use.</w:t>
       </w:r>
     </w:p>
     <w:p>
@@ -397,12 +283,10 @@
         <w:pStyle w:val="ListBullet"/>
       </w:pPr>
       <w:r>
-        <w:t>Applied structured problem-solving to large datasets and technical</w:t>
-      </w:r>
-    </w:p>
-    <w:p>
-      <w:r>
-        <w:t>issues in a multidisciplinary environment.</w:t>
+        <w:rPr>
+          <w:b w:val="0"/>
+        </w:rPr>
+        <w:t>Applied structured problem-solving to large datasets and technical issues in a multidisciplinary environment.</w:t>
       </w:r>
     </w:p>
     <w:p>
@@ -413,6 +297,9 @@
         <w:t>Electronics Intern</w:t>
       </w:r>
       <w:r>
+        <w:rPr>
+          <w:b w:val="0"/>
+        </w:rPr>
         <w:t xml:space="preserve"> | Pike Works Ltd, Birmingham | Aug-Sep 2022</w:t>
       </w:r>
     </w:p>
@@ -421,22 +308,10 @@
         <w:pStyle w:val="ListBullet"/>
       </w:pPr>
       <w:r>
-        <w:t>Supported practical electronics and engineering activities,</w:t>
-      </w:r>
-    </w:p>
-    <w:p>
-      <w:r>
-        <w:t>developing experience of technical problem-solving, testing and</w:t>
-      </w:r>
-    </w:p>
-    <w:p>
-      <w:r>
-        <w:t>professional engineering work.</w:t>
-      </w:r>
-    </w:p>
-    <w:p>
-      <w:r>
-        <w:t>&gt;</w:t>
+        <w:rPr>
+          <w:b w:val="0"/>
+        </w:rPr>
+        <w:t>Supported practical electronics and engineering activities, developing experience of technical problem-solving, testing and professional engineering work.</w:t>
       </w:r>
     </w:p>
     <w:p>
@@ -444,12 +319,10 @@
         <w:pStyle w:val="ListBullet"/>
       </w:pPr>
       <w:r>
-        <w:t>Worked carefully with technical requirements and communicated</w:t>
-      </w:r>
-    </w:p>
-    <w:p>
-      <w:r>
-        <w:t>progress within a workplace engineering environment.</w:t>
+        <w:rPr>
+          <w:b w:val="0"/>
+        </w:rPr>
+        <w:t>Worked carefully with technical requirements and communicated progress within a workplace engineering environment.</w:t>
       </w:r>
     </w:p>
     <w:p>
@@ -462,22 +335,15 @@
     </w:p>
     <w:p>
       <w:r>
-        <w:t>Approximately 50 EMBL-EBI training modules completed across data science</w:t>
-      </w:r>
-    </w:p>
-    <w:p>
-      <w:r>
-        <w:t>and bioinformatics. Additional customer-facing experience includes</w:t>
-      </w:r>
-    </w:p>
-    <w:p>
-      <w:r>
-        <w:t>Homebase and McDonald's.</w:t>
+        <w:rPr>
+          <w:b w:val="0"/>
+        </w:rPr>
+        <w:t>Approximately 50 EMBL-EBI training modules completed across data science and bioinformatics. Additional customer-facing experience includes Homebase and McDonald's.</w:t>
       </w:r>
     </w:p>
     <w:sectPr>
       <w:pgSz w:w="12240" w:h="15840"/>
-      <w:pgMar w:top="1440" w:right="1800" w:bottom="1440" w:left="1800" w:header="720" w:footer="720" w:gutter="0"/>
+      <w:pgMar w:top="907" w:right="1020" w:bottom="907" w:left="1020" w:header="720" w:footer="720" w:gutter="0"/>
       <w:cols w:space="720"/>
       <w:docGrid w:linePitch="360"/>
     </w:sectPr>
@@ -848,9 +714,12 @@
     <w:name w:val="Normal"/>
     <w:qFormat/>
     <w:rsid w:val="00FC693F"/>
+    <w:pPr>
+      <w:spacing w:after="60"/>
+    </w:pPr>
     <w:rPr>
       <w:rFonts w:ascii="Calibri" w:hAnsi="Calibri"/>
-      <w:sz w:val="22"/>
+      <w:sz w:val="21"/>
     </w:rPr>
   </w:style>
   <w:style w:type="paragraph" w:styleId="Header">

</xml_diff>